<commit_message>
Clarify original totalVI dataset provenance
</commit_message>
<xml_diff>
--- a/deliverables/FusionVI_Technical_Report.docx
+++ b/deliverables/FusionVI_Technical_Report.docx
@@ -23,6 +23,16 @@
     <w:p>
       <w:r>
         <w:t>Technical report | Multimodal AI for therapeutic discovery</w:t>
+      </w:r>
+    </w:p>
+    <w:p>
+      <w:r>
+        <w:rPr>
+          <w:b/>
+          <w:color w:val="172554"/>
+          <w:sz w:val="20"/>
+        </w:rPr>
+        <w:t>Dataset: official SLN111 spleen/lymph-node CITE-seq object released with the totalVI paper (Gayoso et al., Nature Methods 2021)</w:t>
       </w:r>
     </w:p>
     <w:p>
@@ -101,7 +111,7 @@
           </w:tcPr>
           <w:p>
             <w:r>
-              <w:t>Official SLN111 object from the totalVI reproducibility repository</w:t>
+              <w:t>Official SLN111 object released with the totalVI paper and reproducibility repository</w:t>
             </w:r>
           </w:p>
         </w:tc>

</xml_diff>